<commit_message>
v1.6.37 — §207.4 attorney cert, rename-dup fix, minor parents fields, autosave
- Attorney cert certifies under 22 NYCRR §207.4(a)&(b) (forms match official/typeface)
  instead of the §130-1.1-a not-frivolous language (per court request)
- Saving a loaded case under a new name now deletes the old record, so renaming
  no longer leaves an orphaned duplicate in the case list
- Add decedent Sex field; mother/father name + alive fields for minor
  distributees and will beneficiaries, with auto-derive from decedent
- Re-enable debounced auto-save with load-guard and empty-form guards

Co-Authored-By: Claude Opus 4.8 (1M context) <noreply@anthropic.com>
</commit_message>
<xml_diff>
--- a/templates/Not Using Word Docs/newcertform_6_59_19_PM.docx
+++ b/templates/Not Using Word Docs/newcertform_6_59_19_PM.docx
@@ -46,11 +46,9 @@
         <w:jc w:val="both"/>
       </w:pPr>
       <w:r>
-        <w:tab/>
-      </w:r>
-      <w:r>
-        <w:t>I, JESSICA WILSON, the undersigned, an attorney admitted to practice law in the Courts of the State of New York, state that I am the attorney for the petitioner in the within action and certify that to the best of my knowledge, information and belief, formed after an inquiry reasonable under the circumstances, that the matters contained herein are not frivolous as defined in 22NYCRR, Section 130-1.1-a, subsection (a).</w:t>
-      </w:r>
+        <w:t>I, JESSICA WILSON, the undersigned, an attorney admitted to practice law in the Courts of the State of New York and the attorney for the petitioner herein, hereby certify pursuant to Sections 207.4(a) and (b) of the Uniform Rules for the Surrogate's Court that the typeface utilized in the foregoing forms complies with subsection (a) of the aforesaid rule, and that the text used in the foregoing forms is the same as that contained in the official forms and that the substantive text has not been altered.</w:t>
+      </w:r>
+      <w:r/>
     </w:p>
     <w:p/>
     <w:p/>

</xml_diff>